<commit_message>
Compliance-Dokument: Name korrigiert (Kurt Haidecker → Martin Heidecker)
An 3 Stellen im Dokument den falschen Namen korrigiert.

Co-Authored-By: Claude Opus 4.6 <noreply@anthropic.com>
</commit_message>
<xml_diff>
--- a/src/public/pdf/LYNX_Lining_Compliance_Dokumentation.docx
+++ b/src/public/pdf/LYNX_Lining_Compliance_Dokumentation.docx
@@ -111,7 +111,7 @@
           <w:sz w:val="22"/>
           <w:szCs w:val="22"/>
         </w:rPr>
-        <w:t xml:space="preserve">Ing. Kurt Haidecker</w:t>
+        <w:t xml:space="preserve">Ing. Martin Heidecker</w:t>
       </w:r>
     </w:p>
     <w:p>
@@ -345,7 +345,7 @@
           <w:sz w:val="20"/>
           <w:szCs w:val="20"/>
         </w:rPr>
-        <w:t xml:space="preserve">Firmenname, Inhaber (Ing. Kurt Haidecker), Adresse, Kontaktdaten</w:t>
+        <w:t xml:space="preserve">Firmenname, Inhaber (Ing. Martin Heidecker), Adresse, Kontaktdaten</w:t>
       </w:r>
     </w:p>
     <w:p>
@@ -6812,7 +6812,7 @@
           <w:sz w:val="18"/>
           <w:szCs w:val="18"/>
         </w:rPr>
-        <w:t xml:space="preserve">LYNX Lining — Ing. Kurt Haidecker</w:t>
+        <w:t xml:space="preserve">LYNX Lining — Ing. Martin Heidecker</w:t>
       </w:r>
     </w:p>
     <w:sectPr>

</xml_diff>